<commit_message>
new bloag and italic bible verses
</commit_message>
<xml_diff>
--- a/blog.docx
+++ b/blog.docx
@@ -4,349 +4,272 @@
   <w:body>
     <w:p>
       <w:r>
-        <w:t>"</w:t>
-      </w:r>
-      <w:proofErr w:type="gramStart"/>
-      <w:r>
-        <w:t>Love"—</w:t>
-      </w:r>
-      <w:proofErr w:type="gramEnd"/>
-      <w:r>
-        <w:t xml:space="preserve">isn't it a feeling everyone strives for? Longs for? Is it something that sustains us, or is it a luxury? Does everyone stand a chance? Does anyone truly stand a chance of finding it? Or is it just lust we misinterpret? Is it a feeling, an action, or a responsibility? Is it something everyone </w:t>
-      </w:r>
-      <w:proofErr w:type="gramStart"/>
-      <w:r>
-        <w:t>has to</w:t>
-      </w:r>
-      <w:proofErr w:type="gramEnd"/>
-      <w:r>
-        <w:t xml:space="preserve"> oblige, or is it only for the people who deserve it or chase it?</w:t>
+        <w:t>Every being goes through changes, but it is often misinterpreted as a bad thing when it comes to humans who change. Are changes necessary? Are they biblical? What does God think of a changing person?</w:t>
       </w:r>
     </w:p>
     <w:p>
       <w:r>
-        <w:t>What I interpret it as is a concoction of all of these: a feeling that transitions into responsibility, a luxury which could become a necessity, and an obligation which should be kept.</w:t>
-      </w:r>
-    </w:p>
-    <w:p>
-      <w:pPr>
-        <w:rPr>
-          <w:b/>
-          <w:bCs/>
-        </w:rPr>
-      </w:pPr>
-      <w:r>
-        <w:rPr>
-          <w:b/>
-          <w:bCs/>
-        </w:rPr>
-        <w:t>What is Love?</w:t>
+        <w:t>In this study, we will see what change really means and how it can affect a person's life or nature. We will also see what the Bible teaches about it.</w:t>
       </w:r>
     </w:p>
     <w:p>
       <w:r>
-        <w:t>This is a complex question to answer in a single line or a paragraph; the answer takes form based on the circumstances and the point of view from which it is based. We will look at the most common reference to it: a relationship. Do we need love to be in a relationship? Is love a necessity?</w:t>
-      </w:r>
-    </w:p>
-    <w:p>
-      <w:pPr>
         <w:rPr>
           <w:b/>
-          <w:bCs/>
         </w:rPr>
-      </w:pPr>
-      <w:r>
-        <w:rPr>
-          <w:b/>
-          <w:bCs/>
-        </w:rPr>
-        <w:t>What is love in a relationship?</w:t>
+        <w:t>What Is Change?</w:t>
       </w:r>
     </w:p>
     <w:p>
       <w:r>
-        <w:t xml:space="preserve">"People fall in love with the wrong people </w:t>
-      </w:r>
-      <w:proofErr w:type="gramStart"/>
-      <w:r>
-        <w:t>sometimes"—</w:t>
-      </w:r>
-      <w:proofErr w:type="gramEnd"/>
-      <w:r>
-        <w:t xml:space="preserve">this is something we have heard a lot, but this is the furthest thing from love. Falling in love with the wrong person destroys the whole point of love. Love is not something you get or feel in a moment; it is something cherished. It is a feeling cherished every single day, minute, and second. There is no one who is "wrong" here; the idea of a person being wrong in love is absurd. The moment someone is wrong, it </w:t>
-      </w:r>
-      <w:proofErr w:type="gramStart"/>
-      <w:r>
-        <w:t>was never love</w:t>
-      </w:r>
-      <w:proofErr w:type="gramEnd"/>
-      <w:r>
-        <w:t xml:space="preserve"> to begin with.</w:t>
+        <w:t>Definition: Make (someone or something) different; alter or modify. This definition makes it clear that change is essentially a replacement or alteration of something you already have.</w:t>
       </w:r>
     </w:p>
     <w:p>
       <w:r>
-        <w:t>"Love at first sight" is something many people are fascinated by, but I think of it as the ultimate misrepresentation of love. I would consider "enemies to lovers" as more real than people who fall in love at first sight. The only thing you notice at first sight is a person's looks and how they carry themselves; how could that make you want to live with them forever? This is nothing but a mere misinterpretation of lust as love. This is the situation that leads to "falling in love with the wrong person," but this couldn’t really be called falling in love, could it?</w:t>
-      </w:r>
-    </w:p>
-    <w:p>
-      <w:pPr>
-        <w:rPr>
-          <w:b/>
-          <w:bCs/>
-        </w:rPr>
-      </w:pPr>
-      <w:r>
-        <w:rPr>
-          <w:b/>
-          <w:bCs/>
-        </w:rPr>
-        <w:t xml:space="preserve">What makes a person wrong? How does love </w:t>
+        <w:t xml:space="preserve">For example, waking up early in the morning is a change because it modifies your existing sleeping cycle. Something is considered not </w:t>
       </w:r>
       <w:proofErr w:type="gramStart"/>
       <w:r>
-        <w:rPr>
-          <w:b/>
-          <w:bCs/>
-        </w:rPr>
-        <w:t>make</w:t>
+        <w:t>a change</w:t>
       </w:r>
       <w:proofErr w:type="gramEnd"/>
       <w:r>
-        <w:rPr>
-          <w:b/>
-          <w:bCs/>
-        </w:rPr>
-        <w:t xml:space="preserve"> it right?</w:t>
+        <w:t xml:space="preserve"> when it remains in equilibrium or in a constant state.</w:t>
       </w:r>
     </w:p>
     <w:p>
       <w:r>
-        <w:t xml:space="preserve">Many face troubles during a relationship, but from this, can we conclude that a person is "wrong"? Can a relationship </w:t>
-      </w:r>
-      <w:proofErr w:type="gramStart"/>
-      <w:r>
-        <w:t>built</w:t>
-      </w:r>
-      <w:proofErr w:type="gramEnd"/>
-      <w:r>
-        <w:t xml:space="preserve"> on love be broken because of these troubles? My simple answer </w:t>
-      </w:r>
-      <w:proofErr w:type="gramStart"/>
-      <w:r>
-        <w:t>is:</w:t>
-      </w:r>
-      <w:proofErr w:type="gramEnd"/>
-      <w:r>
-        <w:t xml:space="preserve"> it </w:t>
-      </w:r>
-      <w:proofErr w:type="gramStart"/>
-      <w:r>
-        <w:t>was never love</w:t>
-      </w:r>
-      <w:proofErr w:type="gramEnd"/>
-      <w:r>
-        <w:t xml:space="preserve"> to begin with.</w:t>
+        <w:t>Change can include both good and bad, better and worse. This raises an important question: what is a good change and what is a bad change?</w:t>
       </w:r>
     </w:p>
     <w:p>
       <w:r>
-        <w:t xml:space="preserve">Even though I don’t believe in many things said about love, I do believe "every lover is a fighter." How can you be a lover when you don’t fight for it? Love makes things right. Even though obstacles make a person seem "wrong" for a relationship, true love overthrows every obstacle to make things right. Let's take the most common trouble faced in relationships: societal pressure (differences in status, caste, financial background, etc.). Do you really think these could be a reason for a person to leave the one they love? The answer is simple: it </w:t>
-      </w:r>
-      <w:proofErr w:type="gramStart"/>
-      <w:r>
-        <w:t>was never love</w:t>
-      </w:r>
-      <w:proofErr w:type="gramEnd"/>
-      <w:r>
-        <w:t xml:space="preserve"> to begin with. True love is when you put it above anything else.</w:t>
-      </w:r>
-    </w:p>
-    <w:p>
-      <w:pPr>
-        <w:rPr>
-          <w:b/>
-          <w:bCs/>
-        </w:rPr>
-      </w:pPr>
-      <w:r>
-        <w:rPr>
-          <w:b/>
-          <w:bCs/>
-        </w:rPr>
-        <w:lastRenderedPageBreak/>
-        <w:t>The weight of love</w:t>
+        <w:t>There are different kinds of changes as well—changes in habits, character, and spirituality. But an important question remains: Are all good changes truly good?</w:t>
       </w:r>
     </w:p>
     <w:p>
       <w:r>
-        <w:t>Everything in this world is weighed: your salary, weight, opinions, and even your love. A person could have love for many things—for example, money, family, status, etc.—but each of these loves is weighed. When your love for money is above your partner, there is no doubt you'll let them go if it comes down to a choice between the relationship and money. It was—again—never true love to begin with. When you weigh your status over your partner, it is obvious you are going to leave when it comes to your status versus your partner.</w:t>
+        <w:rPr>
+          <w:b/>
+        </w:rPr>
+        <w:t>Types of Changes</w:t>
       </w:r>
     </w:p>
     <w:p>
       <w:r>
-        <w:t xml:space="preserve">The weight you give to your relationship decides if it was true love. This weight invites you to sacrifice from the beginning—a sacrifice which could cost you everything you’ve loved since childhood, which could bring you to ruin. But that is where true love comes </w:t>
-      </w:r>
-      <w:proofErr w:type="gramStart"/>
-      <w:r>
-        <w:t>hand-in-hand</w:t>
-      </w:r>
-      <w:proofErr w:type="gramEnd"/>
-      <w:r>
-        <w:t>: even when you have nothing, love stays. Love stays when you have everything to lose, and when you have nothing left to lose.</w:t>
-      </w:r>
-    </w:p>
-    <w:p>
-      <w:pPr>
         <w:rPr>
           <w:b/>
-          <w:bCs/>
         </w:rPr>
-      </w:pPr>
-      <w:r>
-        <w:rPr>
-          <w:b/>
-          <w:bCs/>
-        </w:rPr>
-        <w:t xml:space="preserve">What does love </w:t>
-      </w:r>
-      <w:proofErr w:type="gramStart"/>
-      <w:r>
-        <w:rPr>
-          <w:b/>
-          <w:bCs/>
-        </w:rPr>
-        <w:t>look</w:t>
-      </w:r>
-      <w:proofErr w:type="gramEnd"/>
-      <w:r>
-        <w:rPr>
-          <w:b/>
-          <w:bCs/>
-        </w:rPr>
-        <w:t xml:space="preserve"> like?</w:t>
+        <w:t>Habit Change</w:t>
       </w:r>
     </w:p>
     <w:p>
       <w:r>
-        <w:t xml:space="preserve">Is love buying expensive gifts? Let's say, expensive gifts when you have nothing—is that love? Going out of your way to do something impressive to win over your </w:t>
-      </w:r>
-      <w:proofErr w:type="gramStart"/>
-      <w:r>
-        <w:t>partner—is</w:t>
-      </w:r>
-      <w:proofErr w:type="gramEnd"/>
-      <w:r>
-        <w:t xml:space="preserve"> that love? No, it is not.</w:t>
+        <w:t>A habit is a settled or regular tendency, routine, or behavior pattern that is acquired through frequent repetition and often occurs unconsciously.</w:t>
       </w:r>
     </w:p>
     <w:p>
       <w:r>
-        <w:t xml:space="preserve">Love is when you gift them a pack of tissues knowing they catch colds easily; it's when they think of calling you first when they can’t sleep; it's making hot soup because you know they love it during winter. Love is knowing you, love is sacrificing for you, love is </w:t>
-      </w:r>
-      <w:r>
-        <w:rPr>
-          <w:i/>
-          <w:iCs/>
-        </w:rPr>
-        <w:t>for</w:t>
-      </w:r>
-      <w:r>
-        <w:t xml:space="preserve"> you. If gifting expensive stuff were true love, only Elon Musk or the top 2% of the population would find it. It was never about money, education, knowledge, or status; it is something that outweighs all of those.</w:t>
-      </w:r>
-    </w:p>
-    <w:p>
-      <w:pPr>
-        <w:rPr>
-          <w:b/>
-          <w:bCs/>
-        </w:rPr>
-      </w:pPr>
-      <w:r>
-        <w:rPr>
-          <w:b/>
-          <w:bCs/>
-        </w:rPr>
-        <w:t>Defining True Love</w:t>
+        <w:t>Habit change is something people achieve through various methods such as the 3Rs framework and other techniques. These changes can be achieved intentionally, but many habits are often picked up unintentionally.</w:t>
       </w:r>
     </w:p>
     <w:p>
       <w:r>
-        <w:t xml:space="preserve">True love is absolute, as the Bible says in </w:t>
-      </w:r>
-      <w:r>
         <w:rPr>
           <w:b/>
-          <w:bCs/>
         </w:rPr>
-        <w:t>1 Corinthians 13:4-7</w:t>
-      </w:r>
-      <w:r>
-        <w:t>:</w:t>
+        <w:t>Spiritual Change</w:t>
       </w:r>
     </w:p>
     <w:p>
       <w:r>
-        <w:t>"4 Love is patient, love is kind. It does not envy, it does not boast, it is not proud. 5 It does not dishonor others, it is not self-seeking, it is not easily angered, it keeps no record of wrongs. 6 Love does not delight in evil but rejoices with the truth. 7 It always protects, always trusts, always hopes, always perseveres. 8 Love never fails."</w:t>
+        <w:t>Spirituality can generally be defined as an individual's search for ultimate or sacred meaning and purpose in life.</w:t>
       </w:r>
     </w:p>
     <w:p>
       <w:r>
-        <w:t>This is the most unerring definition of true love. True love outweighs everything. It becomes something you can't live without—something that sustains you. It is not a luxury, but a necessity.</w:t>
-      </w:r>
-    </w:p>
-    <w:p>
-      <w:pPr>
-        <w:rPr>
-          <w:b/>
-          <w:bCs/>
-        </w:rPr>
-      </w:pPr>
-      <w:r>
-        <w:rPr>
-          <w:b/>
-          <w:bCs/>
-        </w:rPr>
-        <w:t>Who is the perfect example of True Love?</w:t>
+        <w:t>However, this sacred meaning and purpose are not often sought or found by many people. Spiritual change occurs when one's ultimate purpose in life is influenced or redirected.</w:t>
       </w:r>
     </w:p>
     <w:p>
       <w:r>
-        <w:t xml:space="preserve">It is none other than our Lord Jesus Christ. His love outweighed everything He had: heaven, His throne, and His holiness. He thought everything was of no use if I </w:t>
+        <w:t xml:space="preserve">This type of change is intentional, but it is often not possible to achieve through intention alone. This is because our ultimate purpose in life does not depend solely on our intentions, but rather on a deeper reason for our </w:t>
       </w:r>
       <w:proofErr w:type="gramStart"/>
       <w:r>
-        <w:t>wasn’t able to</w:t>
+        <w:t>existence—</w:t>
       </w:r>
       <w:proofErr w:type="gramEnd"/>
       <w:r>
-        <w:t xml:space="preserve"> get there. You might wonder why I am suddenly referring to my own perspective; it is because this is me describing my only true love.</w:t>
+        <w:t>something that has already been given to us since birth.</w:t>
+      </w:r>
+    </w:p>
+    <w:p>
+      <w:r>
+        <w:rPr>
+          <w:b/>
+        </w:rPr>
+        <w:t>Character Change</w:t>
       </w:r>
     </w:p>
     <w:p>
       <w:r>
         <w:lastRenderedPageBreak/>
-        <w:t>He didn’t ask anything from me apart from myself, which is the least I could give. It didn’t come to me at first sight; it was something I am learning to cherish every day. He makes all obstacles go away. There is nothing that could separate me from Him because His love outweighs everything. He was not of my ethnicity, He didn’t even speak my language, but He still loved me the same. Nothing else mattered to Him. This love is not built on luxury or expensive gifts, but on the most precious gift of salvation on the cross, paid with the greatest sacrifice: His own life. He took all my wrongs to make them right. Even when I couldn’t love Him as much as He did, it was I He wanted—not anything else from me. This is the perfect and absolute example of love.</w:t>
-      </w:r>
-    </w:p>
-    <w:p>
-      <w:pPr>
-        <w:rPr>
-          <w:b/>
-          <w:bCs/>
-        </w:rPr>
-      </w:pPr>
-      <w:r>
-        <w:rPr>
-          <w:b/>
-          <w:bCs/>
-        </w:rPr>
-        <w:t>Who deserves love?</w:t>
+        <w:t>The character of a person is the aggregate of their moral, ethical, and mental traits—such as integrity, courage, and honesty—that define their nature and guide their behavior.</w:t>
       </w:r>
     </w:p>
     <w:p>
       <w:r>
-        <w:t>Everyone. No one in this world deserves to live without love. We might not be lucky enough to find someone to care for us in this world, but there is always our Heavenly Father who loves us more than anyone else can. A relationship that does not have Christ at the center will eventually fail because human love is fleeting, but His love compensates for it to make it whole. "If God is for us, who can be against us?" If He is the center, no matter the obstacle or pain, He will guide and lead us, for it was He who brought us together.</w:t>
+        <w:t>Character change can be seen as the result of changes in habits or spiritual transformation. It is the type of change that others can notice in our lives. For example, a person may appear more energetic because of better habits or make wiser decisions because their spiritual outlook has changed.</w:t>
+      </w:r>
+    </w:p>
+    <w:p>
+      <w:r>
+        <w:rPr>
+          <w:b/>
+        </w:rPr>
+        <w:t>Are Changes Good or Bad?</w:t>
+      </w:r>
+    </w:p>
+    <w:p>
+      <w:r>
+        <w:t>To answer this question, let us first see what the Bible says:</w:t>
+      </w:r>
+    </w:p>
+    <w:p>
+      <w:r>
+        <w:rPr>
+          <w:i/>
+        </w:rPr>
+        <w:t>2 Corinthians 5:17 — Therefore, if anyone is in Christ, the new creation has come: The old has gone, the new is here!</w:t>
+      </w:r>
+    </w:p>
+    <w:p>
+      <w:r>
+        <w:t>This verse shows that the Bible expects transformation in a person's life. This idea contradicts many common sayings in the world such as 'you are who you are', 'never change for anyone', or 'just embrace who you are'.</w:t>
+      </w:r>
+    </w:p>
+    <w:p>
+      <w:r>
+        <w:rPr>
+          <w:i/>
+        </w:rPr>
+        <w:t xml:space="preserve">Romans 12:2 — Do not conform to the pattern of this </w:t>
+      </w:r>
+      <w:proofErr w:type="gramStart"/>
+      <w:r>
+        <w:rPr>
+          <w:i/>
+        </w:rPr>
+        <w:t>world, but</w:t>
+      </w:r>
+      <w:proofErr w:type="gramEnd"/>
+      <w:r>
+        <w:rPr>
+          <w:i/>
+        </w:rPr>
+        <w:t xml:space="preserve"> be transformed by the renewing of your mind. Then you will be able to test and approve what God’s will is—his good, pleasing and perfect will.</w:t>
+      </w:r>
+    </w:p>
+    <w:p>
+      <w:r>
+        <w:t>This verse clearly tells us not to conform to the world, but instead to be transformed through the renewing of our minds, which allows us to understand and follow God's will.</w:t>
+      </w:r>
+    </w:p>
+    <w:p>
+      <w:r>
+        <w:rPr>
+          <w:b/>
+        </w:rPr>
+        <w:t>Why Does God Want Us to Change?</w:t>
+      </w:r>
+    </w:p>
+    <w:p>
+      <w:r>
+        <w:rPr>
+          <w:i/>
+        </w:rPr>
+        <w:t>Ephesians 2:10 — For we are God’s handiwork, created in Christ Jesus to do good works, which God prepared in advance for us to do.</w:t>
+      </w:r>
+    </w:p>
+    <w:p>
+      <w:r>
+        <w:t xml:space="preserve">We were created in the image of God to follow Him and to have fellowship with Him. However, sin has led us away from Him. Because of this, transformation becomes necessary to restore our broken and </w:t>
+      </w:r>
+      <w:proofErr w:type="gramStart"/>
+      <w:r>
+        <w:t>corrupted</w:t>
+      </w:r>
+      <w:proofErr w:type="gramEnd"/>
+      <w:r>
+        <w:t xml:space="preserve"> nature.</w:t>
+      </w:r>
+    </w:p>
+    <w:p>
+      <w:r>
+        <w:t>Through the help of our Lord Jesus Christ, these changes allow us to rediscover our true purpose: to do good works and live for God. Achieving this transformation requires God's help, because He is the one who has called us for this purpose.</w:t>
+      </w:r>
+    </w:p>
+    <w:p>
+      <w:r>
+        <w:rPr>
+          <w:b/>
+        </w:rPr>
+        <w:t>The Sole Exception to Change</w:t>
+      </w:r>
+    </w:p>
+    <w:p>
+      <w:r>
+        <w:rPr>
+          <w:i/>
+        </w:rPr>
+        <w:t>Hebrews 13:8 — Jesus Christ is the same yesterday and today and forever.</w:t>
+      </w:r>
+    </w:p>
+    <w:p>
+      <w:r>
+        <w:t>This verse confirms that Jesus Christ never changes. He is perfect and absolute, which is why He does not change. Humans must change because we are imperfect and born in sin, but in Christ there is no imperfection.</w:t>
+      </w:r>
+    </w:p>
+    <w:p>
+      <w:r>
+        <w:rPr>
+          <w:b/>
+        </w:rPr>
+        <w:t>Case Study: Moses — From Stutterer to Great Leader</w:t>
+      </w:r>
+    </w:p>
+    <w:p>
+      <w:r>
+        <w:lastRenderedPageBreak/>
+        <w:t>One of the most powerful examples of transformation in the Bible is Moses. When God called Moses to lead the Israelites out of Egypt, Moses doubted himself because he believed he was not good at speaking.</w:t>
+      </w:r>
+    </w:p>
+    <w:p>
+      <w:r>
+        <w:rPr>
+          <w:i/>
+        </w:rPr>
+        <w:t>Exodus 4:10 — Moses said to the Lord, 'Pardon your servant, Lord. I have never been eloquent... I am slow of speech and tongue.'</w:t>
+      </w:r>
+    </w:p>
+    <w:p>
+      <w:r>
+        <w:t>Moses saw his speech problem as a limitation and believed it disqualified him from leadership. However, God reassured him that He equips those He calls.</w:t>
+      </w:r>
+    </w:p>
+    <w:p>
+      <w:r>
+        <w:rPr>
+          <w:i/>
+        </w:rPr>
+        <w:t>Exodus 4:11–12 — The Lord said to him, 'Who gave human beings their mouths?... Now go; I will help you speak and will teach you what to say.'</w:t>
+      </w:r>
+    </w:p>
+    <w:p>
+      <w:r>
+        <w:t>Through God's guidance, Moses confronted Pharaoh, led the Israelites out of Egypt, received the Ten Commandments, and guided Israel for forty years. This transformation shows that God often uses imperfect people and changes them for His purposes.</w:t>
       </w:r>
     </w:p>
     <w:p/>
@@ -1166,7 +1089,6 @@
   <w:style w:type="character" w:default="1" w:styleId="DefaultParagraphFont">
     <w:name w:val="Default Paragraph Font"/>
     <w:uiPriority w:val="1"/>
-    <w:semiHidden/>
     <w:unhideWhenUsed/>
   </w:style>
   <w:style w:type="table" w:default="1" w:styleId="TableNormal">

</xml_diff>